<commit_message>
final project: update outline and report
</commit_message>
<xml_diff>
--- a/final/report.docx
+++ b/final/report.docx
@@ -639,7 +639,7 @@
     </w:p>
     <w:p>
       <w:pPr>
-        <w:spacing w:line="360" w:lineRule="auto"/>
+        <w:spacing w:before="120" w:after="120" w:line="276" w:lineRule="auto"/>
         <w:rPr>
           <w:rFonts w:eastAsia="Arial"/>
           <w:b/>
@@ -664,7 +664,11 @@
       </w:pPr>
     </w:p>
     <w:bookmarkEnd w:id="1"/>
-    <w:p/>
+    <w:p>
+      <w:pPr>
+        <w:spacing w:before="120" w:after="120" w:line="276" w:lineRule="auto"/>
+      </w:pPr>
+    </w:p>
     <w:tbl>
       <w:tblPr>
         <w:tblStyle w:val="TableGrid"/>
@@ -1331,7 +1335,7 @@
     </w:tbl>
     <w:p>
       <w:pPr>
-        <w:spacing w:line="259" w:lineRule="auto"/>
+        <w:spacing w:before="120" w:after="120" w:line="276" w:lineRule="auto"/>
         <w:ind w:left="96"/>
         <w:jc w:val="center"/>
         <w:rPr>
@@ -1349,7 +1353,7 @@
     </w:p>
     <w:p>
       <w:pPr>
-        <w:spacing w:line="259" w:lineRule="auto"/>
+        <w:spacing w:before="120" w:after="120" w:line="276" w:lineRule="auto"/>
         <w:ind w:left="96"/>
         <w:rPr>
           <w:b/>
@@ -1368,16 +1372,16 @@
     </w:p>
     <w:p>
       <w:pPr>
-        <w:spacing w:after="160" w:line="259" w:lineRule="auto"/>
-        <w:rPr>
-          <w:b/>
-          <w:sz w:val="32"/>
-        </w:rPr>
-      </w:pPr>
-    </w:p>
-    <w:p>
-      <w:pPr>
-        <w:spacing w:after="160" w:line="259" w:lineRule="auto"/>
+        <w:spacing w:before="120" w:after="120" w:line="276" w:lineRule="auto"/>
+        <w:rPr>
+          <w:b/>
+          <w:sz w:val="32"/>
+        </w:rPr>
+      </w:pPr>
+    </w:p>
+    <w:p>
+      <w:pPr>
+        <w:spacing w:before="120" w:after="120" w:line="276" w:lineRule="auto"/>
         <w:rPr>
           <w:b/>
           <w:sz w:val="32"/>
@@ -1450,7 +1454,7 @@
           <w:r>
             <w:fldChar w:fldCharType="separate"/>
           </w:r>
-          <w:hyperlink w:anchor="_Toc215779910" w:history="1">
+          <w:hyperlink w:anchor="_Toc215782556" w:history="1">
             <w:r>
               <w:rPr>
                 <w:rStyle w:val="Hyperlink"/>
@@ -1478,7 +1482,7 @@
                 <w:noProof/>
                 <w:webHidden/>
               </w:rPr>
-              <w:instrText xml:space="preserve"> PAGEREF _Toc215779910 \h </w:instrText>
+              <w:instrText xml:space="preserve"> PAGEREF _Toc215782556 \h </w:instrText>
             </w:r>
             <w:r>
               <w:rPr>
@@ -1522,7 +1526,7 @@
               <w:szCs w:val="22"/>
             </w:rPr>
           </w:pPr>
-          <w:hyperlink w:anchor="_Toc215779911" w:history="1">
+          <w:hyperlink w:anchor="_Toc215782557" w:history="1">
             <w:r>
               <w:rPr>
                 <w:rStyle w:val="Hyperlink"/>
@@ -1550,7 +1554,7 @@
                 <w:noProof/>
                 <w:webHidden/>
               </w:rPr>
-              <w:instrText xml:space="preserve"> PAGEREF _Toc215779911 \h </w:instrText>
+              <w:instrText xml:space="preserve"> PAGEREF _Toc215782557 \h </w:instrText>
             </w:r>
             <w:r>
               <w:rPr>
@@ -1594,7 +1598,7 @@
               <w:szCs w:val="22"/>
             </w:rPr>
           </w:pPr>
-          <w:hyperlink w:anchor="_Toc215779912" w:history="1">
+          <w:hyperlink w:anchor="_Toc215782558" w:history="1">
             <w:r>
               <w:rPr>
                 <w:rStyle w:val="Hyperlink"/>
@@ -1622,7 +1626,7 @@
                 <w:noProof/>
                 <w:webHidden/>
               </w:rPr>
-              <w:instrText xml:space="preserve"> PAGEREF _Toc215779912 \h </w:instrText>
+              <w:instrText xml:space="preserve"> PAGEREF _Toc215782558 \h </w:instrText>
             </w:r>
             <w:r>
               <w:rPr>
@@ -1666,7 +1670,7 @@
               <w:szCs w:val="22"/>
             </w:rPr>
           </w:pPr>
-          <w:hyperlink w:anchor="_Toc215779913" w:history="1">
+          <w:hyperlink w:anchor="_Toc215782559" w:history="1">
             <w:r>
               <w:rPr>
                 <w:rStyle w:val="Hyperlink"/>
@@ -1694,7 +1698,7 @@
                 <w:noProof/>
                 <w:webHidden/>
               </w:rPr>
-              <w:instrText xml:space="preserve"> PAGEREF _Toc215779913 \h </w:instrText>
+              <w:instrText xml:space="preserve"> PAGEREF _Toc215782559 \h </w:instrText>
             </w:r>
             <w:r>
               <w:rPr>
@@ -1738,7 +1742,7 @@
               <w:szCs w:val="22"/>
             </w:rPr>
           </w:pPr>
-          <w:hyperlink w:anchor="_Toc215779914" w:history="1">
+          <w:hyperlink w:anchor="_Toc215782560" w:history="1">
             <w:r>
               <w:rPr>
                 <w:rStyle w:val="Hyperlink"/>
@@ -1766,7 +1770,7 @@
                 <w:noProof/>
                 <w:webHidden/>
               </w:rPr>
-              <w:instrText xml:space="preserve"> PAGEREF _Toc215779914 \h </w:instrText>
+              <w:instrText xml:space="preserve"> PAGEREF _Toc215782560 \h </w:instrText>
             </w:r>
             <w:r>
               <w:rPr>
@@ -1810,7 +1814,7 @@
               <w:szCs w:val="22"/>
             </w:rPr>
           </w:pPr>
-          <w:hyperlink w:anchor="_Toc215779915" w:history="1">
+          <w:hyperlink w:anchor="_Toc215782561" w:history="1">
             <w:r>
               <w:rPr>
                 <w:rStyle w:val="Hyperlink"/>
@@ -1838,7 +1842,7 @@
                 <w:noProof/>
                 <w:webHidden/>
               </w:rPr>
-              <w:instrText xml:space="preserve"> PAGEREF _Toc215779915 \h </w:instrText>
+              <w:instrText xml:space="preserve"> PAGEREF _Toc215782561 \h </w:instrText>
             </w:r>
             <w:r>
               <w:rPr>
@@ -1858,7 +1862,151 @@
                 <w:noProof/>
                 <w:webHidden/>
               </w:rPr>
-              <w:t>4</w:t>
+              <w:t>5</w:t>
+            </w:r>
+            <w:r>
+              <w:rPr>
+                <w:noProof/>
+                <w:webHidden/>
+              </w:rPr>
+              <w:fldChar w:fldCharType="end"/>
+            </w:r>
+          </w:hyperlink>
+        </w:p>
+        <w:p>
+          <w:pPr>
+            <w:pStyle w:val="TOC2"/>
+            <w:tabs>
+              <w:tab w:val="right" w:leader="dot" w:pos="9350"/>
+            </w:tabs>
+            <w:rPr>
+              <w:rFonts w:asciiTheme="minorHAnsi" w:eastAsiaTheme="minorEastAsia" w:hAnsiTheme="minorHAnsi" w:cstheme="minorBidi"/>
+              <w:noProof/>
+              <w:sz w:val="22"/>
+              <w:szCs w:val="22"/>
+            </w:rPr>
+          </w:pPr>
+          <w:hyperlink w:anchor="_Toc215782562" w:history="1">
+            <w:r>
+              <w:rPr>
+                <w:rStyle w:val="Hyperlink"/>
+                <w:rFonts w:eastAsiaTheme="majorEastAsia"/>
+                <w:noProof/>
+              </w:rPr>
+              <w:t>5. Đối tượng và phạm vi nghiên cứu</w:t>
+            </w:r>
+            <w:r>
+              <w:rPr>
+                <w:noProof/>
+                <w:webHidden/>
+              </w:rPr>
+              <w:tab/>
+            </w:r>
+            <w:r>
+              <w:rPr>
+                <w:noProof/>
+                <w:webHidden/>
+              </w:rPr>
+              <w:fldChar w:fldCharType="begin"/>
+            </w:r>
+            <w:r>
+              <w:rPr>
+                <w:noProof/>
+                <w:webHidden/>
+              </w:rPr>
+              <w:instrText xml:space="preserve"> PAGEREF _Toc215782562 \h </w:instrText>
+            </w:r>
+            <w:r>
+              <w:rPr>
+                <w:noProof/>
+                <w:webHidden/>
+              </w:rPr>
+            </w:r>
+            <w:r>
+              <w:rPr>
+                <w:noProof/>
+                <w:webHidden/>
+              </w:rPr>
+              <w:fldChar w:fldCharType="separate"/>
+            </w:r>
+            <w:r>
+              <w:rPr>
+                <w:noProof/>
+                <w:webHidden/>
+              </w:rPr>
+              <w:t>5</w:t>
+            </w:r>
+            <w:r>
+              <w:rPr>
+                <w:noProof/>
+                <w:webHidden/>
+              </w:rPr>
+              <w:fldChar w:fldCharType="end"/>
+            </w:r>
+          </w:hyperlink>
+        </w:p>
+        <w:p>
+          <w:pPr>
+            <w:pStyle w:val="TOC2"/>
+            <w:tabs>
+              <w:tab w:val="right" w:leader="dot" w:pos="9350"/>
+            </w:tabs>
+            <w:rPr>
+              <w:rFonts w:asciiTheme="minorHAnsi" w:eastAsiaTheme="minorEastAsia" w:hAnsiTheme="minorHAnsi" w:cstheme="minorBidi"/>
+              <w:noProof/>
+              <w:sz w:val="22"/>
+              <w:szCs w:val="22"/>
+            </w:rPr>
+          </w:pPr>
+          <w:hyperlink w:anchor="_Toc215782563" w:history="1">
+            <w:r>
+              <w:rPr>
+                <w:rStyle w:val="Hyperlink"/>
+                <w:rFonts w:eastAsiaTheme="majorEastAsia"/>
+                <w:noProof/>
+              </w:rPr>
+              <w:t>6. Phương pháp tiếp cận</w:t>
+            </w:r>
+            <w:r>
+              <w:rPr>
+                <w:noProof/>
+                <w:webHidden/>
+              </w:rPr>
+              <w:tab/>
+            </w:r>
+            <w:r>
+              <w:rPr>
+                <w:noProof/>
+                <w:webHidden/>
+              </w:rPr>
+              <w:fldChar w:fldCharType="begin"/>
+            </w:r>
+            <w:r>
+              <w:rPr>
+                <w:noProof/>
+                <w:webHidden/>
+              </w:rPr>
+              <w:instrText xml:space="preserve"> PAGEREF _Toc215782563 \h </w:instrText>
+            </w:r>
+            <w:r>
+              <w:rPr>
+                <w:noProof/>
+                <w:webHidden/>
+              </w:rPr>
+            </w:r>
+            <w:r>
+              <w:rPr>
+                <w:noProof/>
+                <w:webHidden/>
+              </w:rPr>
+              <w:fldChar w:fldCharType="separate"/>
+            </w:r>
+            <w:r>
+              <w:rPr>
+                <w:noProof/>
+                <w:webHidden/>
+              </w:rPr>
+              <w:t>5</w:t>
             </w:r>
             <w:r>
               <w:rPr>
@@ -1881,60 +2029,489 @@
         </w:p>
       </w:sdtContent>
     </w:sdt>
-    <w:p/>
-    <w:p/>
-    <w:p/>
-    <w:p/>
-    <w:p/>
-    <w:p/>
-    <w:p/>
-    <w:p/>
-    <w:p/>
-    <w:p/>
-    <w:p/>
-    <w:p/>
-    <w:p/>
-    <w:p/>
-    <w:p/>
-    <w:p/>
-    <w:p/>
-    <w:p/>
-    <w:p/>
-    <w:p/>
-    <w:p/>
-    <w:p/>
-    <w:p/>
-    <w:p/>
-    <w:p/>
-    <w:p/>
-    <w:p/>
-    <w:p/>
-    <w:p/>
-    <w:p/>
-    <w:p/>
-    <w:p/>
-    <w:p/>
-    <w:p/>
-    <w:p/>
-    <w:p>
-      <w:pPr>
-        <w:spacing w:after="160" w:line="259" w:lineRule="auto"/>
+    <w:p>
+      <w:pPr>
+        <w:spacing w:before="120" w:after="120" w:line="276" w:lineRule="auto"/>
+      </w:pPr>
+    </w:p>
+    <w:p>
+      <w:pPr>
+        <w:spacing w:before="120" w:after="120" w:line="276" w:lineRule="auto"/>
+      </w:pPr>
+      <w:bookmarkStart w:id="2" w:name="_GoBack"/>
+      <w:bookmarkEnd w:id="2"/>
+    </w:p>
+    <w:p>
+      <w:pPr>
+        <w:spacing w:before="120" w:after="120" w:line="276" w:lineRule="auto"/>
+      </w:pPr>
+    </w:p>
+    <w:p>
+      <w:pPr>
+        <w:spacing w:before="120" w:after="120" w:line="276" w:lineRule="auto"/>
+      </w:pPr>
+    </w:p>
+    <w:p>
+      <w:pPr>
+        <w:spacing w:before="120" w:after="120" w:line="276" w:lineRule="auto"/>
+      </w:pPr>
+    </w:p>
+    <w:p>
+      <w:pPr>
+        <w:spacing w:before="120" w:after="120" w:line="276" w:lineRule="auto"/>
+      </w:pPr>
+    </w:p>
+    <w:p>
+      <w:pPr>
+        <w:spacing w:before="120" w:after="120" w:line="276" w:lineRule="auto"/>
+      </w:pPr>
+    </w:p>
+    <w:p>
+      <w:pPr>
+        <w:spacing w:before="120" w:after="120" w:line="276" w:lineRule="auto"/>
+      </w:pPr>
+    </w:p>
+    <w:p>
+      <w:pPr>
+        <w:spacing w:before="120" w:after="120" w:line="276" w:lineRule="auto"/>
+      </w:pPr>
+    </w:p>
+    <w:p>
+      <w:pPr>
+        <w:spacing w:before="120" w:after="120" w:line="276" w:lineRule="auto"/>
+      </w:pPr>
+    </w:p>
+    <w:p>
+      <w:pPr>
+        <w:spacing w:before="120" w:after="120" w:line="276" w:lineRule="auto"/>
+      </w:pPr>
+    </w:p>
+    <w:p>
+      <w:pPr>
+        <w:spacing w:before="120" w:after="120" w:line="276" w:lineRule="auto"/>
+      </w:pPr>
+    </w:p>
+    <w:p>
+      <w:pPr>
+        <w:spacing w:before="120" w:after="120" w:line="276" w:lineRule="auto"/>
+      </w:pPr>
+    </w:p>
+    <w:p>
+      <w:pPr>
+        <w:spacing w:before="120" w:after="120" w:line="276" w:lineRule="auto"/>
+      </w:pPr>
+    </w:p>
+    <w:p>
+      <w:pPr>
+        <w:spacing w:before="120" w:after="120" w:line="276" w:lineRule="auto"/>
+      </w:pPr>
+    </w:p>
+    <w:p>
+      <w:pPr>
+        <w:spacing w:before="120" w:after="120" w:line="276" w:lineRule="auto"/>
+      </w:pPr>
+    </w:p>
+    <w:p>
+      <w:pPr>
+        <w:spacing w:before="120" w:after="120" w:line="276" w:lineRule="auto"/>
+      </w:pPr>
+    </w:p>
+    <w:p>
+      <w:pPr>
+        <w:spacing w:before="120" w:after="120" w:line="276" w:lineRule="auto"/>
+      </w:pPr>
+    </w:p>
+    <w:p>
+      <w:pPr>
+        <w:spacing w:before="120" w:after="120" w:line="276" w:lineRule="auto"/>
+      </w:pPr>
+    </w:p>
+    <w:p>
+      <w:pPr>
+        <w:spacing w:before="120" w:after="120" w:line="276" w:lineRule="auto"/>
+      </w:pPr>
+    </w:p>
+    <w:p>
+      <w:pPr>
+        <w:spacing w:before="120" w:after="120" w:line="276" w:lineRule="auto"/>
+      </w:pPr>
+    </w:p>
+    <w:p>
+      <w:pPr>
+        <w:spacing w:before="120" w:after="120" w:line="276" w:lineRule="auto"/>
+      </w:pPr>
+    </w:p>
+    <w:p>
+      <w:pPr>
+        <w:spacing w:before="120" w:after="120" w:line="276" w:lineRule="auto"/>
+      </w:pPr>
+    </w:p>
+    <w:p>
+      <w:pPr>
+        <w:pStyle w:val="Heading1"/>
+        <w:spacing w:before="120" w:after="120" w:line="276" w:lineRule="auto"/>
+        <w:jc w:val="center"/>
+      </w:pPr>
+      <w:bookmarkStart w:id="3" w:name="_Toc215782556"/>
+      <w:r>
+        <w:t>TÓM TẮT</w:t>
+      </w:r>
+      <w:bookmarkEnd w:id="3"/>
+    </w:p>
+    <w:p>
+      <w:pPr>
+        <w:pStyle w:val="NormalWeb"/>
+        <w:spacing w:before="120" w:after="120" w:line="276" w:lineRule="auto"/>
+        <w:jc w:val="both"/>
+      </w:pPr>
+      <w:r>
+        <w:t xml:space="preserve">Nghiên cứu này nhằm khai phá các mẫu ẩn và cấu trúc tiềm ẩn trong dữ liệu tuyển dụng quy mô lớn được thu thập từ nền tảng </w:t>
+      </w:r>
+      <w:r>
+        <w:rPr>
+          <w:b/>
+        </w:rPr>
+        <w:t>LinkedIn</w:t>
+      </w:r>
+      <w:r>
+        <w:t xml:space="preserve">. Trên cơ sở bộ dữ liệu chứa thông tin về mô tả công việc, kỹ năng, mức lương và đặc điểm doanh nghiệp, đề tài triển khai ba hướng phân tích chính: (1) phân cụm nghề nghiệp dựa trên mô tả và yêu cầu kỹ năng nhằm nhận diện các nhóm nghề có đặc điểm tương đồng; (2) khai phá luật kết hợp và phân tích mạng kỹ năng để phát hiện các </w:t>
+      </w:r>
+      <w:r>
+        <w:rPr>
+          <w:rStyle w:val="Emphasis"/>
+        </w:rPr>
+        <w:t>skill bundles</w:t>
+      </w:r>
+      <w:r>
+        <w:t xml:space="preserve"> thường được yêu cầu đồng thời trong thị trường lao động; và (3) phân tích các yếu tố tác động đến mức lương, đồng thời xây dựng mô hình dự đoán lương dựa trên đặc trưng công việc và thông tin công ty. Kết quả nghiên cứu cung cấp cái nhìn toàn diện về cấu trúc nghề nghiệp, sự kết hợp kỹ năng và đặc điểm đãi ngộ, qua đó hỗ trợ hiểu rõ hơn xu hướng nhân lực trong bối cảnh thị trường lao động thay đổi nhanh chóng.</w:t>
+      </w:r>
+    </w:p>
+    <w:p>
+      <w:pPr>
+        <w:spacing w:before="120" w:after="120" w:line="276" w:lineRule="auto"/>
+      </w:pPr>
+    </w:p>
+    <w:p>
+      <w:pPr>
+        <w:spacing w:before="120" w:after="120" w:line="276" w:lineRule="auto"/>
+      </w:pPr>
+    </w:p>
+    <w:p>
+      <w:pPr>
+        <w:spacing w:before="120" w:after="120" w:line="276" w:lineRule="auto"/>
+      </w:pPr>
+    </w:p>
+    <w:p>
+      <w:pPr>
+        <w:spacing w:before="120" w:after="120" w:line="276" w:lineRule="auto"/>
+      </w:pPr>
+    </w:p>
+    <w:p>
+      <w:pPr>
+        <w:spacing w:before="120" w:after="120" w:line="276" w:lineRule="auto"/>
+      </w:pPr>
+    </w:p>
+    <w:p>
+      <w:pPr>
+        <w:spacing w:before="120" w:after="120" w:line="276" w:lineRule="auto"/>
+      </w:pPr>
+    </w:p>
+    <w:p>
+      <w:pPr>
+        <w:spacing w:before="120" w:after="120" w:line="276" w:lineRule="auto"/>
+      </w:pPr>
+    </w:p>
+    <w:p>
+      <w:pPr>
+        <w:spacing w:before="120" w:after="120" w:line="276" w:lineRule="auto"/>
+      </w:pPr>
+    </w:p>
+    <w:p>
+      <w:pPr>
+        <w:spacing w:before="120" w:after="120" w:line="276" w:lineRule="auto"/>
+      </w:pPr>
+    </w:p>
+    <w:p>
+      <w:pPr>
+        <w:spacing w:before="120" w:after="120" w:line="276" w:lineRule="auto"/>
+      </w:pPr>
+    </w:p>
+    <w:p>
+      <w:pPr>
+        <w:spacing w:before="120" w:after="120" w:line="276" w:lineRule="auto"/>
+      </w:pPr>
+    </w:p>
+    <w:p>
+      <w:pPr>
+        <w:spacing w:before="120" w:after="120" w:line="276" w:lineRule="auto"/>
+      </w:pPr>
+    </w:p>
+    <w:p>
+      <w:pPr>
+        <w:spacing w:before="120" w:after="120" w:line="276" w:lineRule="auto"/>
+      </w:pPr>
+    </w:p>
+    <w:p>
+      <w:pPr>
+        <w:spacing w:before="120" w:after="120" w:line="276" w:lineRule="auto"/>
+      </w:pPr>
+    </w:p>
+    <w:p>
+      <w:pPr>
+        <w:spacing w:before="120" w:after="120" w:line="276" w:lineRule="auto"/>
+      </w:pPr>
+    </w:p>
+    <w:p>
+      <w:pPr>
+        <w:spacing w:before="120" w:after="120" w:line="276" w:lineRule="auto"/>
+      </w:pPr>
+    </w:p>
+    <w:p>
+      <w:pPr>
+        <w:spacing w:before="120" w:after="120" w:line="276" w:lineRule="auto"/>
+      </w:pPr>
+    </w:p>
+    <w:p>
+      <w:pPr>
+        <w:spacing w:before="120" w:after="120" w:line="276" w:lineRule="auto"/>
+      </w:pPr>
+    </w:p>
+    <w:p>
+      <w:pPr>
+        <w:pStyle w:val="Heading1"/>
+        <w:spacing w:before="120" w:after="120" w:line="276" w:lineRule="auto"/>
       </w:pPr>
       <w:r>
         <w:br w:type="page"/>
       </w:r>
-    </w:p>
-    <w:p>
-      <w:pPr>
-        <w:pStyle w:val="Heading1"/>
-        <w:jc w:val="center"/>
-      </w:pPr>
-      <w:bookmarkStart w:id="2" w:name="_Toc215779910"/>
+      <w:bookmarkStart w:id="4" w:name="_Toc215782557"/>
       <w:r>
         <w:lastRenderedPageBreak/>
-        <w:t>TÓM TẮT</w:t>
-      </w:r>
-      <w:bookmarkEnd w:id="2"/>
+        <w:t>Chương I: Giới thiệu</w:t>
+      </w:r>
+      <w:bookmarkEnd w:id="4"/>
+    </w:p>
+    <w:p>
+      <w:pPr>
+        <w:pStyle w:val="Heading2"/>
+        <w:spacing w:before="120" w:after="120" w:line="276" w:lineRule="auto"/>
+      </w:pPr>
+      <w:bookmarkStart w:id="5" w:name="_Toc215782558"/>
+      <w:r>
+        <w:t>1. Bối cảnh</w:t>
+      </w:r>
+      <w:bookmarkEnd w:id="5"/>
+    </w:p>
+    <w:p>
+      <w:pPr>
+        <w:spacing w:before="120" w:after="120" w:line="276" w:lineRule="auto"/>
+        <w:jc w:val="both"/>
+      </w:pPr>
+      <w:r>
+        <w:t>Trong bối cảnh nền kinh tế số phát triển nhanh chóng, thị trường lao động toàn cầu đang chứng kiến sự biến đổi mạnh mẽ về nhu cầu kỹ năng và cơ cấu nghề nghiệp. Các doanh nghiệp liên tục điều chỉnh yêu cầu tuyển dụng nhằm thích ứng với công nghệ mới, mô hình vận hành linh hoạt và áp lực cạnh tranh ngày càng tăng. LinkedIn, với vai trò là nền tảng nghề nghiệp lớn nhất thế giới, cung cấp nguồn dữ liệu tuyển dụng phong phú và cập nhật theo thời gian thực, phản ánh trực tiếp sự dịch chuyển của nhu cầu nhân lực trên phạm vi toàn cầu. Tuy nhiên, khối lượng dữ liệu lớn và đa dạng này đòi hỏi các phương pháp phân tích tiên tiến để phát hiện những mẫu ẩn, xu hướng ngầm và mối quan hệ phức tạp giữa kỹ năng, mô tả công việc và đặc điểm doanh nghiệp. Trong bối cảnh đó, các kỹ thuật khai phá dữ liệu (Data Mining) trở thành công cụ cần thiết, cho phép khám phá cấu trúc thị trường lao động và đưa ra những hiểu biết sâu sắc phục vụ phân tích, dự báo và hỗ trợ ra quyết định.</w:t>
+      </w:r>
+    </w:p>
+    <w:p>
+      <w:pPr>
+        <w:pStyle w:val="Heading2"/>
+        <w:spacing w:before="120" w:after="120" w:line="276" w:lineRule="auto"/>
+      </w:pPr>
+      <w:bookmarkStart w:id="6" w:name="_Toc215782559"/>
+      <w:r>
+        <w:t>2. Lý do chọn đề tài</w:t>
+      </w:r>
+      <w:bookmarkEnd w:id="6"/>
+    </w:p>
+    <w:p>
+      <w:pPr>
+        <w:spacing w:before="120" w:after="120" w:line="276" w:lineRule="auto"/>
+        <w:jc w:val="both"/>
+      </w:pPr>
+      <w:r>
+        <w:t xml:space="preserve">Bộ dữ liệu </w:t>
+      </w:r>
+      <w:r>
+        <w:rPr>
+          <w:rStyle w:val="Emphasis"/>
+          <w:b/>
+        </w:rPr>
+        <w:t>LinkedIn Job Postings</w:t>
+      </w:r>
+      <w:r>
+        <w:t xml:space="preserve"> được công bố trên Kaggle là một nguồn dữ liệu có cấu trúc rõ ràng và độ bao phủ rộng, bao gồm thông tin về mô tả công việc, kỹ năng, mức lương, loại hình công việc, quy mô công ty và nhiều thuộc tính liên quan. Với sự phong phú và tính hệ thống của dữ liệu, đề tài này phù hợp để triển khai đầy đủ các kỹ thuật cốt lõi của khai phá dữ liệu như phân cụm (clustering), khai phá luật kết hợp (association rule mining) và khai phá mẫu (pattern mining). Việc áp dụng các phương pháp này không chỉ giúp phát hiện những nhóm nghề nghiệp tiềm ẩn, nhận diện các bộ kỹ năng thường đi kèm, mà còn góp phần hiểu rõ những yếu tố chi phối mức lương và cấu trúc tuyển dụng trong từng lĩnh vực. Đồng thời, việc phân tích dữ liệu tuyển dụng hiện nay mang ý nghĩa thực tiễn cao, cung cấp insight quan trọng cho ứng viên, doanh nghiệp, cũng như các nhà hoạch định chính sách về xu hướng nhân lực trong kỷ nguyên việc làm số hóa.</w:t>
+      </w:r>
+    </w:p>
+    <w:p>
+      <w:pPr>
+        <w:pStyle w:val="Heading2"/>
+        <w:spacing w:before="120" w:after="120" w:line="276" w:lineRule="auto"/>
+      </w:pPr>
+      <w:bookmarkStart w:id="7" w:name="_Toc215782560"/>
+      <w:r>
+        <w:t>3. Mục tiêu nghiên cứu</w:t>
+      </w:r>
+      <w:bookmarkEnd w:id="7"/>
+    </w:p>
+    <w:p>
+      <w:pPr>
+        <w:spacing w:before="120" w:after="120" w:line="276" w:lineRule="auto"/>
+        <w:jc w:val="both"/>
+      </w:pPr>
+      <w:r>
+        <w:t xml:space="preserve">Mục tiêu của nghiên cứu này là ứng dụng các kỹ thuật khai phá dữ liệu để phân tích chuyên sâu bộ dữ liệu tuyển dụng trên LinkedIn. Trước hết, nghiên cứu hướng tới việc phân cụm các nhóm nghề nghiệp dựa trên mô tả công việc và bộ kỹ năng yêu cầu, nhằm xác định cấu trúc nghề nghiệp tiềm ẩn và các nhóm ngành có tính tương đồng cao. Tiếp theo, nghiên cứu tập trung khai phá các bộ kỹ năng thường xuất hiện đồng thời trong các bài đăng tuyển dụng, từ đó hình thành các </w:t>
+      </w:r>
+      <w:r>
+        <w:rPr>
+          <w:rStyle w:val="Emphasis"/>
+          <w:b/>
+        </w:rPr>
+        <w:t>skill bundles</w:t>
+      </w:r>
+      <w:r>
+        <w:t xml:space="preserve"> có giá trị trong phân tích nhu cầu nhân lực và định hướng phát triển kỹ năng. Cuối cùng, đề tài xem xét các yếu tố liên quan đến mức lương và xây dựng mô hình dự đoán mức lương dựa trên các đặc trưng như kỹ năng, mô tả công việc, kinh nghiệm và thông tin doanh nghiệp. Ba mục tiêu này kết hợp nhằm tạo nên một cái nhìn toàn diện về đặc điểm tuyển dụng trên LinkedIn và các quy luật ẩn trong dữ liệu.</w:t>
+      </w:r>
+    </w:p>
+    <w:p>
+      <w:pPr>
+        <w:pStyle w:val="Heading2"/>
+        <w:spacing w:before="120" w:after="120" w:line="276" w:lineRule="auto"/>
+      </w:pPr>
+      <w:bookmarkStart w:id="8" w:name="_Toc215782561"/>
+      <w:r>
+        <w:lastRenderedPageBreak/>
+        <w:t>4. Câu hỏi nguyên cứu</w:t>
+      </w:r>
+      <w:bookmarkEnd w:id="8"/>
+    </w:p>
+    <w:p>
+      <w:pPr>
+        <w:spacing w:before="120" w:after="120" w:line="276" w:lineRule="auto"/>
+        <w:jc w:val="both"/>
+      </w:pPr>
+      <w:r>
+        <w:t>Dựa trên mục tiêu của đề tài, nghiên cứu tập trung trả lời ba câu hỏi chính, mỗi câu hỏi phản ánh một hướng khai phá dữ liệu quan trọng.</w:t>
+      </w:r>
+    </w:p>
+    <w:p>
+      <w:pPr>
+        <w:spacing w:before="120" w:after="120" w:line="276" w:lineRule="auto"/>
+      </w:pPr>
+      <w:r>
+        <w:rPr>
+          <w:rStyle w:val="Strong"/>
+        </w:rPr>
+        <w:t>Thứ nhất (RQ1)</w:t>
+      </w:r>
+      <w:r>
+        <w:t xml:space="preserve">, nghiên cứu đặt vấn đề: </w:t>
+      </w:r>
+      <w:r>
+        <w:rPr>
+          <w:rStyle w:val="Emphasis"/>
+        </w:rPr>
+        <w:t>“Các nhóm nghề nghiệp trên thị trường tuyển dụng được hình thành như thế nào dựa trên mô tả công việc và bộ kỹ năng yêu cầu?”</w:t>
+      </w:r>
+      <w:r>
+        <w:br/>
+        <w:t>Câu hỏi này hướng đến việc áp dụng các kỹ thuật phân cụm để khám phá cấu trúc tiềm ẩn của thị trường lao động và xác định những nhóm nghề nghiệp có đặc điểm tương đồng.</w:t>
+      </w:r>
+    </w:p>
+    <w:p>
+      <w:pPr>
+        <w:spacing w:before="120" w:after="120" w:line="276" w:lineRule="auto"/>
+      </w:pPr>
+      <w:r>
+        <w:rPr>
+          <w:rStyle w:val="Strong"/>
+        </w:rPr>
+        <w:t>Thứ hai (RQ2)</w:t>
+      </w:r>
+      <w:r>
+        <w:t xml:space="preserve">, nghiên cứu tìm hiểu: </w:t>
+      </w:r>
+      <w:r>
+        <w:rPr>
+          <w:rStyle w:val="Emphasis"/>
+        </w:rPr>
+        <w:t>“Những kỹ năng nào có xu hướng xuất hiện đồng thời trong các bài tuyển dụng, và liệu có tồn tại các ‘skill bundles’ đặc trưng theo từng nhóm nghề nghiệp hay không?”</w:t>
+      </w:r>
+      <w:r>
+        <w:br/>
+        <w:t>Đây là câu hỏi trọng tâm của khai phá luật kết hợp và phân tích mạng kỹ năng, giúp khám phá các mẫu liên kết giữa kỹ năng và đặc trưng nghề nghiệp.</w:t>
+      </w:r>
+    </w:p>
+    <w:p>
+      <w:pPr>
+        <w:spacing w:before="120" w:after="120" w:line="276" w:lineRule="auto"/>
+        <w:jc w:val="both"/>
+      </w:pPr>
+      <w:r>
+        <w:rPr>
+          <w:rStyle w:val="Strong"/>
+        </w:rPr>
+        <w:t>Thứ ba (RQ3)</w:t>
+      </w:r>
+      <w:r>
+        <w:t xml:space="preserve">, nghiên cứu xem xét: </w:t>
+      </w:r>
+      <w:r>
+        <w:rPr>
+          <w:rStyle w:val="Emphasis"/>
+        </w:rPr>
+        <w:t>“Các yếu tố nào ảnh hưởng đến mức lương, và liệu có thể dự đoán mức lương dựa trên mô tả công việc, kỹ năng, kinh nghiệm và thông tin doanh nghiệp hay không?”</w:t>
+      </w:r>
+      <w:r>
+        <w:br/>
+        <w:t>Câu hỏi này cho phép đánh giá mối liên hệ giữa các đặc trưng công việc và mức lương, đồng thời kiểm chứng khả năng ứng dụng mô hình dự đoán trong bối cảnh dữ liệu tuyển dụng thực tế.</w:t>
+      </w:r>
+    </w:p>
+    <w:p>
+      <w:pPr>
+        <w:spacing w:before="120" w:after="120" w:line="276" w:lineRule="auto"/>
+        <w:jc w:val="both"/>
+      </w:pPr>
+      <w:r>
+        <w:t>Ba câu hỏi nghiên cứu trên được lựa chọn nhằm phản ánh đầy đủ các hướng tiếp cận chính trong khai phá dữ liệu, bao gồm phân cụm, khai phá luật và phân tích dự đoán. Mỗi câu hỏi tập trung vào một khía cạnh đặc thù của dữ liệu tuyển dụng, giúp nghiên cứu khám phá cả cấu trúc nghề nghiệp, mối quan hệ kỹ năng và các yếu tố tác động đến mức lương. Nhờ đó, đề tài đảm bảo tính toàn diện và bám sát mục tiêu phân tích dữ liệu thị trường lao động.</w:t>
+      </w:r>
+    </w:p>
+    <w:p>
+      <w:pPr>
+        <w:pStyle w:val="Heading2"/>
+      </w:pPr>
+      <w:bookmarkStart w:id="9" w:name="_Toc215782562"/>
+      <w:r>
+        <w:t>5. Đối tượng và phạm vi nghiên cứu</w:t>
+      </w:r>
+      <w:bookmarkEnd w:id="9"/>
+    </w:p>
+    <w:p>
+      <w:pPr>
+        <w:spacing w:before="120" w:after="120" w:line="276" w:lineRule="auto"/>
+        <w:jc w:val="both"/>
+      </w:pPr>
+      <w:r>
+        <w:t xml:space="preserve">Đối tượng nghiên cứu của đề tài là dữ liệu tuyển dụng được thu thập từ bộ dữ liệu </w:t>
+      </w:r>
+      <w:r>
+        <w:rPr>
+          <w:rStyle w:val="Emphasis"/>
+          <w:b/>
+        </w:rPr>
+        <w:t>LinkedIn Job Postings</w:t>
+      </w:r>
+      <w:r>
+        <w:t xml:space="preserve"> trên nền tảng Kaggle, bao gồm thông tin về mô tả công việc, bộ kỹ năng yêu cầu, mức lương, loại hình công việc, kinh nghiệm, quy mô doanh nghiệp và các thuộc tính liên quan. Phạm vi nghiên cứu tập trung vào việc phân tích các mẫu dữ liệu có cấu trúc và phi cấu trúc trong bộ dữ liệu này nhằm khám phá các nhóm nghề nghiệp tiềm ẩn, nhận diện các nhóm kỹ năng thường xuất hiện đồng thời, và khảo sát những yếu tố tác động đến mức lương. Nghiên cứu không mở rộng sang các nguồn dữ liệu tuyển dụng khác ngoài LinkedIn và không đánh giá các yếu tố ngoại sinh như đặc điểm ngành nghề theo quốc gia, chính sách lao động hay biến động kinh tế vĩ mô. Việc giới hạn phạm vi như vậy giúp đảm bảo tính tập trung và làm rõ giá trị của các phương pháp khai phá dữ liệu được áp dụng.</w:t>
+      </w:r>
+    </w:p>
+    <w:p>
+      <w:pPr>
+        <w:pStyle w:val="Heading2"/>
+      </w:pPr>
+      <w:bookmarkStart w:id="10" w:name="_Toc215782563"/>
+      <w:r>
+        <w:t>6. Phương pháp tiếp cận</w:t>
+      </w:r>
+      <w:bookmarkEnd w:id="10"/>
     </w:p>
     <w:p>
       <w:pPr>
@@ -1942,231 +2519,14 @@
         <w:jc w:val="both"/>
       </w:pPr>
       <w:r>
-        <w:t xml:space="preserve">Nghiên cứu này nhằm khai phá các mẫu ẩn và cấu trúc tiềm ẩn trong dữ liệu tuyển dụng quy mô lớn được thu thập từ nền tảng </w:t>
-      </w:r>
-      <w:r>
-        <w:rPr>
-          <w:b/>
-        </w:rPr>
-        <w:t>LinkedIn</w:t>
-      </w:r>
-      <w:r>
-        <w:t xml:space="preserve">. Trên cơ sở bộ dữ liệu chứa thông tin về mô tả công việc, kỹ năng, mức lương và đặc điểm doanh nghiệp, đề tài triển khai ba hướng phân tích chính: (1) phân cụm nghề nghiệp dựa trên mô tả và yêu cầu kỹ năng nhằm nhận diện các nhóm nghề có đặc điểm tương đồng; (2) khai phá luật kết hợp và phân tích mạng kỹ năng để phát hiện các </w:t>
-      </w:r>
-      <w:r>
-        <w:rPr>
-          <w:rStyle w:val="Emphasis"/>
-        </w:rPr>
-        <w:t>skill bundles</w:t>
-      </w:r>
-      <w:r>
-        <w:t xml:space="preserve"> thường được yêu cầu đồng thời trong thị trường lao động; và (3) phân tích các yếu tố tác động đến mức lương, đồng thời xây dựng mô hình dự đoán lương dựa trên đặc trưng công việc và thông tin công ty. Kết quả nghiên cứu cung cấp cái nhìn toàn diện về cấu trúc nghề nghiệp, sự kết hợp kỹ năng và đặc điểm đãi ngộ, qua đó hỗ trợ hiểu rõ hơn xu hướng nhân lực trong bối cảnh thị trường lao động thay đổi nhanh chóng.</w:t>
+        <w:t xml:space="preserve">Nghiên cứu áp dụng quy trình khai phá dữ liệu theo hướng tiếp cận CRISP-DM, bao gồm các bước chính: hiểu dữ liệu, tiền xử lý dữ liệu, khai phá mẫu và đánh giá kết quả. Trước hết, dữ liệu từ nhiều tệp liên quan được tích hợp và xử lý để đảm bảo tính đầy đủ và nhất quán, đồng thời chuẩn </w:t>
+      </w:r>
+      <w:r>
+        <w:lastRenderedPageBreak/>
+        <w:t>hóa văn bản trong mô tả công việc và kỹ năng. Sau đó, các kỹ thuật khai phá dữ liệu được triển khai theo từng mục tiêu nghiên cứu: phân cụm (clustering) được sử dụng để nhận diện các nhóm nghề nghiệp dựa trên mô tả và kỹ năng; khai phá luật kết hợp (association rule mining) và phân tích mạng kỹ năng được áp dụng để khám phá các nhóm kỹ năng đồng xuất hiện; và cuối cùng, các kỹ thuật khai phá mẫu và mô hình dự đoán được dùng để phân tích những yếu tố tác động đến mức lương và xây dựng mô hình dự đoán mức lương. Cách tiếp cận này cho phép kết hợp hài hòa giữa phân tích khám phá và mô hình hóa, đảm bảo tính toàn diện và phù hợp với đặc trưng của bài toán khai phá dữ liệu.</w:t>
       </w:r>
     </w:p>
     <w:p/>
-    <w:p/>
-    <w:p/>
-    <w:p/>
-    <w:p/>
-    <w:p>
-      <w:bookmarkStart w:id="3" w:name="_GoBack"/>
-      <w:bookmarkEnd w:id="3"/>
-    </w:p>
-    <w:p/>
-    <w:p/>
-    <w:p/>
-    <w:p/>
-    <w:p/>
-    <w:p/>
-    <w:p/>
-    <w:p/>
-    <w:p/>
-    <w:p/>
-    <w:p/>
-    <w:p/>
-    <w:p>
-      <w:pPr>
-        <w:pStyle w:val="Heading1"/>
-      </w:pPr>
-      <w:r>
-        <w:br w:type="page"/>
-      </w:r>
-      <w:bookmarkStart w:id="4" w:name="_Toc215779911"/>
-      <w:r>
-        <w:lastRenderedPageBreak/>
-        <w:t>Chương I: Giới thiệu</w:t>
-      </w:r>
-      <w:bookmarkEnd w:id="4"/>
-    </w:p>
-    <w:p>
-      <w:pPr>
-        <w:pStyle w:val="Heading2"/>
-      </w:pPr>
-      <w:bookmarkStart w:id="5" w:name="_Toc215779912"/>
-      <w:r>
-        <w:t>1. Bối cảnh</w:t>
-      </w:r>
-      <w:bookmarkEnd w:id="5"/>
-    </w:p>
-    <w:p>
-      <w:pPr>
-        <w:jc w:val="both"/>
-      </w:pPr>
-      <w:r>
-        <w:t>Trong bối cảnh nền kinh tế số phát triển nhanh chóng, thị trường lao động toàn cầu đang chứng kiến sự biến đổi mạnh mẽ về nhu cầu kỹ năng và cơ cấu nghề nghiệp. Các doanh nghiệp liên tục điều chỉnh yêu cầu tuyển dụng nhằm thích ứng với công nghệ mới, mô hình vận hành linh hoạt và áp lực cạnh tranh ngày càng tăng. LinkedIn, với vai trò là nền tảng nghề nghiệp lớn nhất thế giới, cung cấp nguồn dữ liệu tuyển dụng phong phú và cập nhật theo thời gian thực, phản ánh trực tiếp sự dịch chuyển của nhu cầu nhân lực trên phạm vi toàn cầu. Tuy nhiên, khối lượng dữ liệu lớn và đa dạng này đòi hỏi các phương pháp phân tích tiên tiến để phát hiện những mẫu ẩn, xu hướng ngầm và mối quan hệ phức tạp giữa kỹ năng, mô tả công việc và đặc điểm doanh nghiệp. Trong bối cảnh đó, các kỹ thuật khai phá dữ liệu (Data Mining) trở thành công cụ cần thiết, cho phép khám phá cấu trúc thị trường lao động và đưa ra những hiểu biết sâu sắc phục vụ phân tích, dự báo và hỗ trợ ra quyết định.</w:t>
-      </w:r>
-    </w:p>
-    <w:p>
-      <w:pPr>
-        <w:pStyle w:val="Heading2"/>
-      </w:pPr>
-      <w:bookmarkStart w:id="6" w:name="_Toc215779913"/>
-      <w:r>
-        <w:t>2. Lý do chọn đề tài</w:t>
-      </w:r>
-      <w:bookmarkEnd w:id="6"/>
-    </w:p>
-    <w:p>
-      <w:pPr>
-        <w:jc w:val="both"/>
-      </w:pPr>
-      <w:r>
-        <w:t xml:space="preserve">Bộ dữ liệu </w:t>
-      </w:r>
-      <w:r>
-        <w:rPr>
-          <w:rStyle w:val="Emphasis"/>
-          <w:b/>
-        </w:rPr>
-        <w:t>LinkedIn Job Postings</w:t>
-      </w:r>
-      <w:r>
-        <w:t xml:space="preserve"> được công bố trên Kaggle là một nguồn dữ liệu có cấu trúc rõ ràng và độ bao phủ rộng, bao gồm thông tin về mô tả công việc, kỹ năng, mức lương, loại hình công việc, quy mô công ty và nhiều thuộc tính liên quan. Với sự phong phú và tính hệ thống của dữ liệu, đề tài này phù hợp để triển khai đầy đủ các kỹ thuật cốt lõi của khai phá dữ liệu như phân cụm (clustering), khai phá luật kết hợp (association rule mining) và khai phá mẫu (pattern mining). Việc áp dụng các phương pháp này không chỉ giúp phát hiện những nhóm nghề nghiệp tiềm ẩn, nhận diện các bộ kỹ năng thường đi kèm, mà còn góp phần hiểu rõ những yếu tố chi phối mức lương và cấu trúc tuyển dụng trong từng lĩnh vực. Đồng thời, việc phân tích dữ liệu tuyển dụng hiện nay mang ý nghĩa thực tiễn cao, cung cấp insight quan trọng cho ứng viên, doanh nghiệp, cũng như các nhà hoạch định chính sách về xu hướng nhân lực trong kỷ nguyên việc làm số hóa.</w:t>
-      </w:r>
-    </w:p>
-    <w:p>
-      <w:pPr>
-        <w:pStyle w:val="Heading2"/>
-      </w:pPr>
-      <w:bookmarkStart w:id="7" w:name="_Toc215779914"/>
-      <w:r>
-        <w:t>3. Mục tiêu nghiên cứu</w:t>
-      </w:r>
-      <w:bookmarkEnd w:id="7"/>
-    </w:p>
-    <w:p>
-      <w:pPr>
-        <w:jc w:val="both"/>
-      </w:pPr>
-      <w:r>
-        <w:t xml:space="preserve">Mục tiêu của nghiên cứu này là ứng dụng các kỹ thuật khai phá dữ liệu để phân tích chuyên sâu bộ dữ liệu tuyển dụng trên LinkedIn. Trước hết, nghiên cứu hướng tới việc phân cụm các nhóm nghề nghiệp dựa trên mô tả công việc và bộ kỹ năng yêu cầu, nhằm xác định cấu trúc nghề nghiệp tiềm ẩn và các nhóm ngành có tính tương đồng cao. Tiếp theo, nghiên cứu tập trung khai phá các bộ kỹ năng thường xuất hiện đồng thời trong các bài đăng tuyển dụng, từ đó hình thành các </w:t>
-      </w:r>
-      <w:r>
-        <w:rPr>
-          <w:rStyle w:val="Emphasis"/>
-          <w:b/>
-        </w:rPr>
-        <w:t>skill bundles</w:t>
-      </w:r>
-      <w:r>
-        <w:t xml:space="preserve"> có giá trị trong phân tích nhu cầu nhân lực và định hướng phát triển kỹ năng. Cuối cùng, đề tài xem xét các yếu tố liên quan đến mức lương và xây dựng mô hình dự đoán mức lương dựa trên các đặc trưng như kỹ năng, mô tả công việc, kinh nghiệm và thông tin doanh nghiệp. Ba mục tiêu này kết hợp nhằm tạo nên một cái nhìn toàn diện về đặc điểm tuyển dụng trên LinkedIn và các quy luật ẩn trong dữ liệu.</w:t>
-      </w:r>
-    </w:p>
-    <w:p>
-      <w:pPr>
-        <w:pStyle w:val="Heading2"/>
-      </w:pPr>
-      <w:bookmarkStart w:id="8" w:name="_Toc215779915"/>
-      <w:r>
-        <w:t>4. Câu hỏi nguyên cứu</w:t>
-      </w:r>
-      <w:bookmarkEnd w:id="8"/>
-    </w:p>
-    <w:p>
-      <w:pPr>
-        <w:jc w:val="both"/>
-      </w:pPr>
-      <w:r>
-        <w:t>Dựa trên mục tiêu của đề tài, nghiên cứu tập trung trả lời ba câu hỏi chính, mỗi câu hỏi phản ánh một hướng khai phá dữ liệu quan trọng.</w:t>
-      </w:r>
-    </w:p>
-    <w:p>
-      <w:r>
-        <w:rPr>
-          <w:rStyle w:val="Strong"/>
-        </w:rPr>
-        <w:t>Thứ nhất (RQ1)</w:t>
-      </w:r>
-      <w:r>
-        <w:t xml:space="preserve">, nghiên cứu đặt vấn đề: </w:t>
-      </w:r>
-      <w:r>
-        <w:rPr>
-          <w:rStyle w:val="Emphasis"/>
-        </w:rPr>
-        <w:t>“Các nhóm nghề nghiệp trên thị trường tuyển dụng được hình thành như thế nào dựa trên mô tả công việc và bộ kỹ năng yêu cầu?”</w:t>
-      </w:r>
-      <w:r>
-        <w:br/>
-        <w:t>Câu hỏi này hướng đến việc áp dụng các kỹ thuật phân cụm để khám phá cấu trúc tiềm ẩn của thị trường lao động và xác định những nhóm nghề nghiệp có đặc điểm tương đồng.</w:t>
-      </w:r>
-    </w:p>
-    <w:p>
-      <w:r>
-        <w:rPr>
-          <w:rStyle w:val="Strong"/>
-        </w:rPr>
-        <w:t>Thứ hai (RQ2)</w:t>
-      </w:r>
-      <w:r>
-        <w:t xml:space="preserve">, nghiên cứu tìm hiểu: </w:t>
-      </w:r>
-      <w:r>
-        <w:rPr>
-          <w:rStyle w:val="Emphasis"/>
-        </w:rPr>
-        <w:t>“Những kỹ năng nào có xu hướng xuất hiện đồng thời trong các bài tuyển dụng, và liệu có tồn tại các ‘skill bundles’ đặc trưng theo từng nhóm nghề nghiệp hay không?”</w:t>
-      </w:r>
-      <w:r>
-        <w:br/>
-      </w:r>
-      <w:r>
-        <w:lastRenderedPageBreak/>
-        <w:t>Đây là câu hỏi trọng tâm của khai phá luật kết hợp và phân tích mạng kỹ năng, giúp khám phá các mẫu liên kết giữa kỹ năng và đặc trưng nghề nghiệp.</w:t>
-      </w:r>
-    </w:p>
-    <w:p>
-      <w:pPr>
-        <w:jc w:val="both"/>
-      </w:pPr>
-      <w:r>
-        <w:rPr>
-          <w:rStyle w:val="Strong"/>
-        </w:rPr>
-        <w:t>Thứ ba (RQ3)</w:t>
-      </w:r>
-      <w:r>
-        <w:t xml:space="preserve">, nghiên cứu xem xét: </w:t>
-      </w:r>
-      <w:r>
-        <w:rPr>
-          <w:rStyle w:val="Emphasis"/>
-        </w:rPr>
-        <w:t>“Các yếu tố nào ảnh hưởng đến mức lương, và liệu có thể dự đoán mức lương dựa trên mô tả công việc, kỹ năng, kinh nghiệm và thông tin doanh nghiệp hay không?”</w:t>
-      </w:r>
-      <w:r>
-        <w:br/>
-        <w:t>Câu hỏi này cho phép đánh giá mối liên hệ giữa các đặc trưng công việc và mức lương, đồng thời kiểm chứng khả năng ứng dụng mô hình dự đoán trong bối cảnh dữ liệu tuyển dụng thực tế.</w:t>
-      </w:r>
-    </w:p>
-    <w:p>
-      <w:pPr>
-        <w:jc w:val="both"/>
-      </w:pPr>
-      <w:r>
-        <w:t>Ba câu hỏi nghiên cứu trên được lựa chọn nhằm phản ánh đầy đủ các hướng tiếp cận chính trong khai phá dữ liệu, bao gồm phân cụm, khai phá luật và phân tích dự đoán. Mỗi câu hỏi tập trung vào một khía cạnh đặc thù của dữ liệu tuyển dụng, giúp nghiên cứu khám phá cả cấu trúc nghề nghiệp, mối quan hệ kỹ năng và các yếu tố tác động đến mức lương. Nhờ đó, đề tài đảm bảo tính toàn diện và bám sát mục tiêu phân tích dữ liệu thị trường lao động.</w:t>
-      </w:r>
-    </w:p>
     <w:sectPr>
       <w:pgSz w:w="12240" w:h="15840"/>
       <w:pgMar w:top="1440" w:right="1440" w:bottom="1440" w:left="1440" w:header="720" w:footer="720" w:gutter="0"/>
@@ -3475,7 +3835,7 @@
 </file>
 
 <file path=customXml/itemProps1.xml><?xml version="1.0" encoding="utf-8"?>
-<ds:datastoreItem xmlns:ds="http://schemas.openxmlformats.org/officeDocument/2006/customXml" ds:itemID="{07EB6321-F789-4949-9A44-AF52FC1E4964}">
+<ds:datastoreItem xmlns:ds="http://schemas.openxmlformats.org/officeDocument/2006/customXml" ds:itemID="{E37FFAAE-8891-4E0D-95A4-B6460CF9B68D}">
   <ds:schemaRefs>
     <ds:schemaRef ds:uri="http://schemas.openxmlformats.org/officeDocument/2006/bibliography"/>
   </ds:schemaRefs>

</xml_diff>